<commit_message>
Fix invoice footer wrapping
</commit_message>
<xml_diff>
--- a/app/resources/invoicing/Rechnung-4.docx
+++ b/app/resources/invoicing/Rechnung-4.docx
@@ -2969,7 +2969,9 @@
                               <w:rFonts w:cs="Segoe UI"/>
                               <w:szCs w:val="16"/>
                             </w:rPr>
-                            <w:t>Vertreten einzeln durch den Geschäftsführer: Tamás Lányi</w:t>
+                            <w:t>Vertreten einzeln durch den Geschäftsführer:</w:t>
+                            <w:br/>
+                            <w:t>Tamás Lányi</w:t>
                           </w:r>
                         </w:p>
                         <w:p>
@@ -3312,7 +3314,9 @@
                         <w:rFonts w:cs="Segoe UI"/>
                         <w:szCs w:val="16"/>
                       </w:rPr>
-                      <w:t>Vertreten einzeln durch den Geschäftsführer: Tamás Lányi</w:t>
+                      <w:t>Vertreten einzeln durch den Geschäftsführer:</w:t>
+                      <w:br/>
+                      <w:t>Tamás Lányi</w:t>
                     </w:r>
                   </w:p>
                   <w:p>

</xml_diff>

<commit_message>
Harden invoice template layout
</commit_message>
<xml_diff>
--- a/app/resources/invoicing/Rechnung-4.docx
+++ b/app/resources/invoicing/Rechnung-4.docx
@@ -1,8 +1,8 @@
 
 <file path=word/document.xml><?xml version="1.0" encoding="utf-8"?>
-<w:document xmlns:wpc="http://schemas.microsoft.com/office/word/2010/wordprocessingCanvas" xmlns:cx="http://schemas.microsoft.com/office/drawing/2014/chartex" xmlns:cx1="http://schemas.microsoft.com/office/drawing/2015/9/8/chartex" xmlns:cx2="http://schemas.microsoft.com/office/drawing/2015/10/21/chartex" xmlns:cx3="http://schemas.microsoft.com/office/drawing/2016/5/9/chartex" xmlns:cx4="http://schemas.microsoft.com/office/drawing/2016/5/10/chartex" xmlns:cx5="http://schemas.microsoft.com/office/drawing/2016/5/11/chartex" xmlns:cx6="http://schemas.microsoft.com/office/drawing/2016/5/12/chartex" xmlns:cx7="http://schemas.microsoft.com/office/drawing/2016/5/13/chartex" xmlns:cx8="http://schemas.microsoft.com/office/drawing/2016/5/14/chartex" xmlns:mc="http://schemas.openxmlformats.org/markup-compatibility/2006" xmlns:aink="http://schemas.microsoft.com/office/drawing/2016/ink" xmlns:am3d="http://schemas.microsoft.com/office/drawing/2017/model3d" xmlns:o="urn:schemas-microsoft-com:office:office" xmlns:oel="http://schemas.microsoft.com/office/2019/extlst" xmlns:r="http://schemas.openxmlformats.org/officeDocument/2006/relationships" xmlns:m="http://schemas.openxmlformats.org/officeDocument/2006/math" xmlns:v="urn:schemas-microsoft-com:vml" xmlns:wp14="http://schemas.microsoft.com/office/word/2010/wordprocessingDrawing" xmlns:wp="http://schemas.openxmlformats.org/drawingml/2006/wordprocessingDrawing" xmlns:w10="urn:schemas-microsoft-com:office:word" xmlns:w="http://schemas.openxmlformats.org/wordprocessingml/2006/main" xmlns:w14="http://schemas.microsoft.com/office/word/2010/wordml" xmlns:w15="http://schemas.microsoft.com/office/word/2012/wordml" xmlns:w16cex="http://schemas.microsoft.com/office/word/2018/wordml/cex" xmlns:w16cid="http://schemas.microsoft.com/office/word/2016/wordml/cid" xmlns:w16="http://schemas.microsoft.com/office/word/2018/wordml" xmlns:w16sdtdh="http://schemas.microsoft.com/office/word/2020/wordml/sdtdatahash" xmlns:w16se="http://schemas.microsoft.com/office/word/2015/wordml/symex" xmlns:wpg="http://schemas.microsoft.com/office/word/2010/wordprocessingGroup" xmlns:wpi="http://schemas.microsoft.com/office/word/2010/wordprocessingInk" xmlns:wne="http://schemas.microsoft.com/office/word/2006/wordml" xmlns:wps="http://schemas.microsoft.com/office/word/2010/wordprocessingShape" mc:Ignorable="w14 w15 w16se w16cid w16 w16cex w16sdtdh wp14">
+<w:document xmlns:ns1="http://schemas.openxmlformats.org/markup-compatibility/2006" xmlns:ns10="http://schemas.openxmlformats.org/officeDocument/2006/relationships" xmlns:ns2="http://schemas.microsoft.com/office/word/2010/wordml" xmlns:ns3="http://schemas.openxmlformats.org/drawingml/2006/wordprocessingDrawing" xmlns:ns4="http://schemas.microsoft.com/office/word/2010/wordprocessingDrawing" xmlns:ns5="http://schemas.openxmlformats.org/drawingml/2006/main" xmlns:ns6="http://schemas.microsoft.com/office/word/2010/wordprocessingShape" xmlns:ns7="urn:schemas-microsoft-com:vml" xmlns:ns8="urn:schemas-microsoft-com:office:office" xmlns:ns9="urn:schemas-microsoft-com:office:word" xmlns:w="http://schemas.openxmlformats.org/wordprocessingml/2006/main" ns1:Ignorable="w14 w15 w16se w16cid w16 w16cex w16sdtdh wp14">
   <w:body>
-    <w:p>
+    <w:p ns2:paraId="77025A87" ns2:textId="174443C1">
       <w:pPr>
         <w:pStyle w:val="Absenderzeile-Fensterbrief"/>
         <w:rPr>
@@ -14,50 +14,50 @@
           <w:rFonts w:cs="Segoe UI"/>
           <w:noProof/>
         </w:rPr>
-        <mc:AlternateContent>
-          <mc:Choice Requires="wps">
+        <ns1:AlternateContent>
+          <ns1:Choice Requires="wps">
             <w:drawing>
-              <wp:anchor distT="0" distB="0" distL="114300" distR="114300" simplePos="0" relativeHeight="251657728" behindDoc="0" locked="0" layoutInCell="1" allowOverlap="1" wp14:anchorId="567BE3B8" wp14:editId="6FBF4197">
-                <wp:simplePos x="0" y="0"/>
-                <wp:positionH relativeFrom="page">
-                  <wp:posOffset>88265</wp:posOffset>
-                </wp:positionH>
-                <wp:positionV relativeFrom="page">
-                  <wp:posOffset>3650615</wp:posOffset>
-                </wp:positionV>
-                <wp:extent cx="277495" cy="284480"/>
-                <wp:effectExtent l="0" t="0" r="0" b="0"/>
-                <wp:wrapNone/>
-                <wp:docPr id="307" name="Textfeld 2"/>
-                <wp:cNvGraphicFramePr>
-                  <a:graphicFrameLocks xmlns:a="http://schemas.openxmlformats.org/drawingml/2006/main"/>
-                </wp:cNvGraphicFramePr>
-                <a:graphic xmlns:a="http://schemas.openxmlformats.org/drawingml/2006/main">
-                  <a:graphicData uri="http://schemas.microsoft.com/office/word/2010/wordprocessingShape">
-                    <wps:wsp>
-                      <wps:cNvSpPr txBox="1">
-                        <a:spLocks noChangeArrowheads="1"/>
-                      </wps:cNvSpPr>
-                      <wps:spPr bwMode="auto">
-                        <a:xfrm>
-                          <a:off x="0" y="0"/>
-                          <a:ext cx="277495" cy="284480"/>
-                        </a:xfrm>
-                        <a:prstGeom prst="rect">
-                          <a:avLst/>
-                        </a:prstGeom>
-                        <a:noFill/>
-                        <a:ln w="9525">
-                          <a:noFill/>
-                          <a:miter lim="800000"/>
-                          <a:headEnd/>
-                          <a:tailEnd/>
-                        </a:ln>
-                        <a:effectLst/>
-                      </wps:spPr>
-                      <wps:txbx>
+              <ns3:anchor distT="0" distB="0" distL="114300" distR="114300" simplePos="0" relativeHeight="251657728" behindDoc="0" locked="0" layoutInCell="1" allowOverlap="1" ns4:anchorId="567BE3B8" ns4:editId="6FBF4197">
+                <ns3:simplePos x="0" y="0"/>
+                <ns3:positionH relativeFrom="page">
+                  <ns3:posOffset>88265</ns3:posOffset>
+                </ns3:positionH>
+                <ns3:positionV relativeFrom="page">
+                  <ns3:posOffset>3650615</ns3:posOffset>
+                </ns3:positionV>
+                <ns3:extent cx="277495" cy="284480"/>
+                <ns3:effectExtent l="0" t="0" r="0" b="0"/>
+                <ns3:wrapNone/>
+                <ns3:docPr id="307" name="Textfeld 2"/>
+                <ns3:cNvGraphicFramePr>
+                  <ns5:graphicFrameLocks/>
+                </ns3:cNvGraphicFramePr>
+                <ns5:graphic>
+                  <ns5:graphicData uri="http://schemas.microsoft.com/office/word/2010/wordprocessingShape">
+                    <ns6:wsp>
+                      <ns6:cNvSpPr txBox="1">
+                        <ns5:spLocks noChangeArrowheads="1"/>
+                      </ns6:cNvSpPr>
+                      <ns6:spPr bwMode="auto">
+                        <ns5:xfrm>
+                          <ns5:off x="0" y="0"/>
+                          <ns5:ext cx="277495" cy="284480"/>
+                        </ns5:xfrm>
+                        <ns5:prstGeom prst="rect">
+                          <ns5:avLst/>
+                        </ns5:prstGeom>
+                        <ns5:noFill/>
+                        <ns5:ln w="9525">
+                          <ns5:noFill/>
+                          <ns5:miter lim="800000"/>
+                          <ns5:headEnd/>
+                          <ns5:tailEnd/>
+                        </ns5:ln>
+                        <ns5:effectLst/>
+                      </ns6:spPr>
+                      <ns6:txbx>
                         <w:txbxContent>
-                          <w:p>
+                          <w:p ns2:paraId="070B026F" ns2:textId="77777777">
                             <w:r>
                               <w:rPr>
                                 <w:rFonts w:cs="Segoe UI"/>
@@ -66,32 +66,32 @@
                             </w:r>
                           </w:p>
                         </w:txbxContent>
-                      </wps:txbx>
-                      <wps:bodyPr rot="0" vert="horz" wrap="square" lIns="91440" tIns="45720" rIns="91440" bIns="45720" anchor="t" anchorCtr="0">
-                        <a:noAutofit/>
-                      </wps:bodyPr>
-                    </wps:wsp>
-                  </a:graphicData>
-                </a:graphic>
-                <wp14:sizeRelH relativeFrom="margin">
-                  <wp14:pctWidth>0</wp14:pctWidth>
-                </wp14:sizeRelH>
-                <wp14:sizeRelV relativeFrom="margin">
-                  <wp14:pctHeight>0</wp14:pctHeight>
-                </wp14:sizeRelV>
-              </wp:anchor>
+                      </ns6:txbx>
+                      <ns6:bodyPr rot="0" vert="horz" wrap="square" lIns="91440" tIns="45720" rIns="91440" bIns="45720" anchor="t" anchorCtr="0">
+                        <ns5:noAutofit/>
+                      </ns6:bodyPr>
+                    </ns6:wsp>
+                  </ns5:graphicData>
+                </ns5:graphic>
+                <ns4:sizeRelH relativeFrom="margin">
+                  <ns4:pctWidth>0</ns4:pctWidth>
+                </ns4:sizeRelH>
+                <ns4:sizeRelV relativeFrom="margin">
+                  <ns4:pctHeight>0</ns4:pctHeight>
+                </ns4:sizeRelV>
+              </ns3:anchor>
             </w:drawing>
-          </mc:Choice>
-          <mc:Fallback>
+          </ns1:Choice>
+          <ns1:Fallback>
             <w:pict>
-              <v:shapetype w14:anchorId="567BE3B8" id="_x0000_t202" coordsize="21600,21600" o:spt="202" path="m,l,21600r21600,l21600,xe">
-                <v:stroke joinstyle="miter"/>
-                <v:path gradientshapeok="t" o:connecttype="rect"/>
-              </v:shapetype>
-              <v:shape id="Textfeld 2" o:spid="_x0000_s1026" type="#_x0000_t202" style="position:absolute;margin-left:6.95pt;margin-top:287.45pt;width:21.85pt;height:22.4pt;z-index:251657728;visibility:visible;mso-wrap-style:square;mso-width-percent:0;mso-height-percent:0;mso-wrap-distance-left:9pt;mso-wrap-distance-top:0;mso-wrap-distance-right:9pt;mso-wrap-distance-bottom:0;mso-position-horizontal:absolute;mso-position-horizontal-relative:page;mso-position-vertical:absolute;mso-position-vertical-relative:page;mso-width-percent:0;mso-height-percent:0;mso-width-relative:margin;mso-height-relative:margin;v-text-anchor:top" o:gfxdata="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" filled="f" stroked="f">
-                <v:textbox>
+              <ns7:shapetype ns2:anchorId="567BE3B8" id="_x0000_t202" coordsize="21600,21600" ns8:spt="202" path="m,l,21600r21600,l21600,xe">
+                <ns7:stroke joinstyle="miter"/>
+                <ns7:path gradientshapeok="t" ns8:connecttype="rect"/>
+              </ns7:shapetype>
+              <ns7:shape id="Textfeld 2" ns8:spid="_x0000_s1026" type="#_x0000_t202" style="position:absolute;margin-left:6.95pt;margin-top:287.45pt;width:21.85pt;height:22.4pt;z-index:251657728;visibility:visible;mso-wrap-style:square;mso-width-percent:0;mso-height-percent:0;mso-wrap-distance-left:9pt;mso-wrap-distance-top:0;mso-wrap-distance-right:9pt;mso-wrap-distance-bottom:0;mso-position-horizontal:absolute;mso-position-horizontal-relative:page;mso-position-vertical:absolute;mso-position-vertical-relative:page;mso-width-percent:0;mso-height-percent:0;mso-width-relative:margin;mso-height-relative:margin;v-text-anchor:top" ns8:gfxdata="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" filled="f" stroked="f">
+                <ns7:textbox>
                   <w:txbxContent>
-                    <w:p>
+                    <w:p ns2:paraId="070B026F" ns2:textId="77777777">
                       <w:r>
                         <w:rPr>
                           <w:rFonts w:cs="Segoe UI"/>
@@ -100,12 +100,12 @@
                       </w:r>
                     </w:p>
                   </w:txbxContent>
-                </v:textbox>
-                <w10:wrap anchorx="page" anchory="page"/>
-              </v:shape>
+                </ns7:textbox>
+                <ns9:wrap anchorx="page" anchory="page"/>
+              </ns7:shape>
             </w:pict>
-          </mc:Fallback>
-        </mc:AlternateContent>
+          </ns1:Fallback>
+        </ns1:AlternateContent>
       </w:r>
       <w:r>
         <w:rPr>
@@ -114,7 +114,7 @@
         <w:t>tops.net GmbH &amp; Co. KG – Holtorfer Str 35 - 53229 Bonn</w:t>
       </w:r>
     </w:p>
-    <w:p>
+    <w:p ns2:paraId="3057D186" ns2:textId="77777777">
       <w:pPr>
         <w:framePr w:w="2713" w:h="2251" w:hSpace="141" w:wrap="around" w:vAnchor="text" w:hAnchor="page" w:x="8845" w:y="4"/>
         <w:shd w:val="solid" w:color="FFFFFF" w:fill="FFFFFF"/>
@@ -236,7 +236,7 @@
       </w:r>
       <w:bookmarkEnd w:id="0"/>
     </w:p>
-    <w:p>
+    <w:p ns2:paraId="340DCB7C" ns2:textId="77777777">
       <w:pPr>
         <w:framePr w:w="2713" w:h="2251" w:hSpace="141" w:wrap="around" w:vAnchor="text" w:hAnchor="page" w:x="8845" w:y="4"/>
         <w:shd w:val="solid" w:color="FFFFFF" w:fill="FFFFFF"/>
@@ -356,7 +356,7 @@
         <w:fldChar w:fldCharType="end"/>
       </w:r>
     </w:p>
-    <w:p>
+    <w:p ns2:paraId="10442AAB" ns2:textId="77777777">
       <w:pPr>
         <w:framePr w:w="2713" w:h="2251" w:hSpace="141" w:wrap="around" w:vAnchor="text" w:hAnchor="page" w:x="8845" w:y="4"/>
         <w:shd w:val="solid" w:color="FFFFFF" w:fill="FFFFFF"/>
@@ -471,7 +471,7 @@
       </w:r>
       <w:bookmarkEnd w:id="1"/>
     </w:p>
-    <w:p>
+    <w:p ns2:paraId="222594B3" ns2:textId="77777777">
       <w:pPr>
         <w:framePr w:w="2713" w:h="2251" w:hSpace="141" w:wrap="around" w:vAnchor="text" w:hAnchor="page" w:x="8845" w:y="4"/>
         <w:shd w:val="solid" w:color="FFFFFF" w:fill="FFFFFF"/>
@@ -620,7 +620,7 @@
         <w:t xml:space="preserve"> 5206/5809/0145</w:t>
       </w:r>
     </w:p>
-    <w:p>
+    <w:p ns2:paraId="16C661CF" ns2:textId="77777777">
       <w:pPr>
         <w:framePr w:w="2713" w:h="2251" w:hSpace="141" w:wrap="around" w:vAnchor="text" w:hAnchor="page" w:x="8845" w:y="4"/>
         <w:shd w:val="solid" w:color="FFFFFF" w:fill="FFFFFF"/>
@@ -652,7 +652,7 @@
         <w:t xml:space="preserve"> DE182607448</w:t>
       </w:r>
     </w:p>
-    <w:p>
+    <w:p ns2:paraId="53A30050" ns2:textId="77777777">
       <w:pPr>
         <w:framePr w:w="2713" w:h="2251" w:hSpace="141" w:wrap="around" w:vAnchor="text" w:hAnchor="page" w:x="8845" w:y="4"/>
         <w:shd w:val="solid" w:color="FFFFFF" w:fill="FFFFFF"/>
@@ -744,7 +744,7 @@
       </w:r>
       <w:bookmarkEnd w:id="3"/>
     </w:p>
-    <w:p>
+    <w:p ns2:paraId="2F4FED28" ns2:textId="77777777">
       <w:pPr>
         <w:framePr w:w="2713" w:h="2251" w:hSpace="141" w:wrap="around" w:vAnchor="text" w:hAnchor="page" w:x="8845" w:y="4"/>
         <w:shd w:val="solid" w:color="FFFFFF" w:fill="FFFFFF"/>
@@ -757,7 +757,7 @@
         </w:rPr>
       </w:pPr>
     </w:p>
-    <w:p>
+    <w:p ns2:paraId="2849E72F" ns2:textId="77777777">
       <w:pPr>
         <w:framePr w:w="2713" w:h="2251" w:hSpace="141" w:wrap="around" w:vAnchor="text" w:hAnchor="page" w:x="8845" w:y="4"/>
         <w:shd w:val="solid" w:color="FFFFFF" w:fill="FFFFFF"/>
@@ -861,7 +861,7 @@
       <w:bookmarkEnd w:id="4"/>
     </w:p>
     <w:bookmarkStart w:id="5" w:name="txtEmpfName"/>
-    <w:p>
+    <w:p ns2:paraId="3636ACC6" ns2:textId="77777777">
       <w:pPr>
         <w:shd w:val="solid" w:color="FFFFFF" w:fill="FFFFFF"/>
         <w:spacing w:after="0" w:line="240" w:lineRule="auto"/>
@@ -917,7 +917,7 @@
       <w:bookmarkEnd w:id="5"/>
     </w:p>
     <w:bookmarkStart w:id="6" w:name="txtEmpfStrasse"/>
-    <w:p>
+    <w:p ns2:paraId="6A8EF255" ns2:textId="77777777">
       <w:pPr>
         <w:shd w:val="solid" w:color="FFFFFF" w:fill="FFFFFF"/>
         <w:spacing w:after="0" w:line="240" w:lineRule="auto"/>
@@ -973,7 +973,7 @@
       <w:bookmarkEnd w:id="6"/>
     </w:p>
     <w:bookmarkStart w:id="7" w:name="txtEmpfOrt"/>
-    <w:p>
+    <w:p ns2:paraId="08F38EE2" ns2:textId="77777777">
       <w:pPr>
         <w:shd w:val="solid" w:color="FFFFFF" w:fill="FFFFFF"/>
         <w:spacing w:after="0" w:line="240" w:lineRule="auto"/>
@@ -1034,7 +1034,7 @@
         <w:t xml:space="preserve"> </w:t>
       </w:r>
     </w:p>
-    <w:p>
+    <w:p ns2:paraId="02BD2C14" ns2:textId="77777777">
       <w:pPr>
         <w:shd w:val="solid" w:color="FFFFFF" w:fill="FFFFFF"/>
         <w:spacing w:after="0" w:line="240" w:lineRule="auto"/>
@@ -1043,7 +1043,7 @@
         </w:rPr>
       </w:pPr>
     </w:p>
-    <w:p>
+    <w:p ns2:paraId="2E50A2AE" ns2:textId="77777777">
       <w:pPr>
         <w:shd w:val="solid" w:color="FFFFFF" w:fill="FFFFFF"/>
         <w:spacing w:after="0" w:line="240" w:lineRule="auto"/>
@@ -1052,7 +1052,7 @@
         </w:rPr>
       </w:pPr>
     </w:p>
-    <w:p>
+    <w:p ns2:paraId="667DB584" ns2:textId="77777777">
       <w:pPr>
         <w:spacing w:after="0" w:line="240" w:lineRule="auto"/>
         <w:rPr>
@@ -1060,7 +1060,7 @@
         </w:rPr>
       </w:pPr>
     </w:p>
-    <w:p>
+    <w:p ns2:paraId="7FA984A8" ns2:textId="77777777">
       <w:pPr>
         <w:tabs>
           <w:tab w:val="left" w:pos="5175"/>
@@ -1072,7 +1072,7 @@
         </w:rPr>
       </w:pPr>
     </w:p>
-    <w:p>
+    <w:p ns2:paraId="25531CF7" ns2:textId="77777777">
       <w:pPr>
         <w:tabs>
           <w:tab w:val="left" w:pos="5175"/>
@@ -1084,7 +1084,7 @@
         </w:rPr>
       </w:pPr>
     </w:p>
-    <w:p>
+    <w:p ns2:paraId="008AF3FF" ns2:textId="77777777">
       <w:pPr>
         <w:spacing w:after="0" w:line="240" w:lineRule="auto"/>
         <w:rPr>
@@ -1225,7 +1225,7 @@
       </w:r>
       <w:bookmarkEnd w:id="9"/>
     </w:p>
-    <w:p>
+    <w:p ns2:paraId="6DBF1CF4" ns2:textId="77777777">
       <w:pPr>
         <w:spacing w:after="0" w:line="240" w:lineRule="auto"/>
         <w:rPr>
@@ -1243,7 +1243,7 @@
         <w:t>(bitte bei Zahlung angeben)</w:t>
       </w:r>
     </w:p>
-    <w:p>
+    <w:p ns2:paraId="57C6B9FF" ns2:textId="77777777">
       <w:pPr>
         <w:spacing w:after="0" w:line="240" w:lineRule="auto"/>
         <w:rPr>
@@ -1253,7 +1253,7 @@
         </w:rPr>
       </w:pPr>
     </w:p>
-    <w:p>
+    <w:p ns2:paraId="7DDA4CAA" ns2:textId="77777777">
       <w:pPr>
         <w:spacing w:after="60" w:line="240" w:lineRule="auto"/>
         <w:rPr>
@@ -1295,7 +1295,11 @@
         <w:gridCol w:w="1701"/>
         <w:gridCol w:w="1559"/>
       </w:tblGrid>
-      <w:tr>
+      <w:tr ns2:paraId="5402AEB9" ns2:textId="77777777">
+        <w:trPr>
+          <w:cantSplit/>
+          <w:tblHeader/>
+        </w:trPr>
         <w:tblPrEx>
           <w:tblCellMar>
             <w:top w:w="0" w:type="dxa"/>
@@ -1306,7 +1310,7 @@
           <w:tcPr>
             <w:tcW w:w="779" w:type="dxa"/>
           </w:tcPr>
-          <w:p>
+          <w:p ns2:paraId="3ABC1E94" ns2:textId="77777777">
             <w:pPr>
               <w:keepLines/>
               <w:spacing w:after="0" w:line="240" w:lineRule="auto"/>
@@ -1326,7 +1330,7 @@
               <w:t>Position</w:t>
             </w:r>
           </w:p>
-          <w:p>
+          <w:p ns2:paraId="5DEDE151" ns2:textId="77777777">
             <w:pPr>
               <w:spacing w:after="0" w:line="240" w:lineRule="auto"/>
               <w:rPr>
@@ -1358,7 +1362,7 @@
           <w:tcPr>
             <w:tcW w:w="5387" w:type="dxa"/>
           </w:tcPr>
-          <w:p>
+          <w:p ns2:paraId="09E9BA32" ns2:textId="77777777">
             <w:pPr>
               <w:keepNext/>
               <w:spacing w:after="0" w:line="240" w:lineRule="auto"/>
@@ -1383,7 +1387,7 @@
           <w:tcPr>
             <w:tcW w:w="1701" w:type="dxa"/>
           </w:tcPr>
-          <w:p>
+          <w:p ns2:paraId="6698B481" ns2:textId="77777777">
             <w:pPr>
               <w:spacing w:after="0" w:line="240" w:lineRule="auto"/>
               <w:rPr>
@@ -1408,7 +1412,7 @@
           <w:tcPr>
             <w:tcW w:w="1559" w:type="dxa"/>
           </w:tcPr>
-          <w:p>
+          <w:p ns2:paraId="0B519661" ns2:textId="77777777">
             <w:pPr>
               <w:keepNext/>
               <w:spacing w:after="0" w:line="240" w:lineRule="auto"/>
@@ -1433,449 +1437,464 @@
           </w:p>
         </w:tc>
       </w:tr>
-      <ns0:tr xmlns:ns0="http://schemas.openxmlformats.org/wordprocessingml/2006/main" xmlns:ns1="http://schemas.microsoft.com/office/word/2010/wordml" ns0:rsidR="001B553F" ns0:rsidRPr="00507815" ns1:paraId="745E9F36" ns1:textId="77777777" ns0:rsidTr="00507815">
-        <ns0:tblPrEx>
-          <ns0:tblCellMar>
-            <ns0:top ns0:w="0" ns0:type="dxa"/>
-            <ns0:bottom ns0:w="0" ns0:type="dxa"/>
-          </ns0:tblCellMar>
-        </ns0:tblPrEx>
-        <ns0:tc>
-          <ns0:tcPr>
-            <ns0:tcW ns0:w="779" ns0:type="dxa"/>
-          </ns0:tcPr>
-          <ns0:p ns1:paraId="20611CC3" ns1:textId="77777777" ns0:rsidR="001B553F" ns0:rsidRDefault="001B553F" ns0:rsidP="00507815">
-            <ns0:pPr>
-              <ns0:keepLines/>
-              <ns0:spacing ns0:after="0" ns0:line="240" ns0:lineRule="auto"/>
-              <ns0:outlineLvl ns0:val="2"/>
-              <ns0:rPr>
-                <ns0:rFonts ns0:cs="Segoe UI"/>
-                <ns0:sz ns0:val="15"/>
-                <ns0:szCs ns0:val="15"/>
-              </ns0:rPr>
-            </ns0:pPr>
-            <ns0:r>
-              <ns0:rPr>
-                <ns0:rFonts ns0:cs="Segoe UI"/>
-                <ns0:sz ns0:val="15"/>
-                <ns0:szCs ns0:val="15"/>
-              </ns0:rPr>
-              <ns0:t>__LINE_POSITION__</ns0:t>
-            </ns0:r>
-          </ns0:p>
-          <ns0:p ns1:paraId="516BFD19" ns1:textId="77777777" ns0:rsidR="001B553F" ns0:rsidRDefault="001B553F" ns0:rsidP="00507815">
-            <ns0:pPr>
-              <ns0:keepLines/>
-              <ns0:spacing ns0:after="0" ns0:line="240" ns0:lineRule="auto"/>
-              <ns0:outlineLvl ns0:val="2"/>
-              <ns0:rPr>
-                <ns0:rFonts ns0:cs="Segoe UI"/>
-                <ns0:sz ns0:val="15"/>
-                <ns0:szCs ns0:val="15"/>
-              </ns0:rPr>
-            </ns0:pPr>
-            <ns0:r>
-              <ns0:rPr>
-                <ns0:rFonts ns0:cs="Segoe UI"/>
-                <ns0:sz ns0:val="15"/>
-                <ns0:szCs ns0:val="15"/>
-              </ns0:rPr>
-              <ns0:t/>
-            </ns0:r>
-          </ns0:p>
-          <ns0:p ns1:paraId="7C9ECD5F" ns1:textId="36D9854B" ns0:rsidR="001B553F" ns0:rsidRPr="00507815" ns0:rsidRDefault="001B553F" ns0:rsidP="00507815">
-            <ns0:pPr>
-              <ns0:keepLines/>
-              <ns0:spacing ns0:after="0" ns0:line="240" ns0:lineRule="auto"/>
-              <ns0:outlineLvl ns0:val="2"/>
-              <ns0:rPr>
-                <ns0:rFonts ns0:cs="Segoe UI"/>
-                <ns0:sz ns0:val="15"/>
-                <ns0:szCs ns0:val="15"/>
-              </ns0:rPr>
-            </ns0:pPr>
-            <ns0:r>
-              <ns0:rPr>
-                <ns0:rFonts ns0:cs="Segoe UI"/>
-                <ns0:sz ns0:val="15"/>
-                <ns0:szCs ns0:val="15"/>
-              </ns0:rPr>
-              <ns0:t>__LINE_TAX__</ns0:t>
-            </ns0:r>
-          </ns0:p>
-        </ns0:tc>
-        <ns0:tc>
-          <ns0:tcPr>
-            <ns0:tcW ns0:w="5387" ns0:type="dxa"/>
-          </ns0:tcPr>
-          <ns0:p ns1:paraId="68FB6840" ns1:textId="77777777" ns0:rsidR="001B553F" ns0:rsidRDefault="001B553F" ns0:rsidP="00507815">
-            <ns0:pPr>
-              <ns0:keepNext/>
-              <ns0:spacing ns0:after="0" ns0:line="240" ns0:lineRule="auto"/>
-              <ns0:outlineLvl ns0:val="2"/>
-              <ns0:rPr>
-                <ns0:rFonts ns0:cs="Segoe UI"/>
-                <ns0:sz ns0:val="15"/>
-                <ns0:szCs ns0:val="15"/>
-              </ns0:rPr>
-            </ns0:pPr>
-            <ns0:r>
-              <ns0:rPr>
-                <ns0:rFonts ns0:cs="Segoe UI"/>
-                <ns0:sz ns0:val="15"/>
-                <ns0:szCs ns0:val="15"/>
-              </ns0:rPr>
-              <ns0:t>__LINE_DESCRIPTION__</ns0:t>
-            </ns0:r>
-          </ns0:p>
-        </ns0:tc>
-        <ns0:tc>
-          <ns0:tcPr>
-            <ns0:tcW ns0:w="1701" ns0:type="dxa"/>
-          </ns0:tcPr>
-          <ns0:p ns1:paraId="070E69E4" ns1:textId="24EAD3E4" ns0:rsidR="001B553F" ns0:rsidRPr="00507815" ns0:rsidRDefault="001B553F" ns0:rsidP="00507815">
-            <ns0:pPr>
-              <ns0:spacing ns0:after="0" ns0:line="240" ns0:lineRule="auto"/>
-              <ns0:rPr>
-                <ns0:rFonts ns0:cs="Segoe UI"/>
-                <ns0:sz ns0:val="15"/>
-                <ns0:szCs ns0:val="15"/>
-                <ns0:lang ns0:val="en-GB"/>
-              </ns0:rPr>
-            </ns0:pPr>
-            <ns0:r>
-              <ns0:rPr>
-                <ns0:rFonts ns0:cs="Segoe UI"/>
-                <ns0:sz ns0:val="15"/>
-                <ns0:szCs ns0:val="15"/>
-                <ns0:lang ns0:val="en-GB"/>
-              </ns0:rPr>
-              <ns0:t>__LINE_QUANTITY__</ns0:t>
-            </ns0:r>
-          </ns0:p>
-        </ns0:tc>
-        <ns0:tc>
-          <ns0:tcPr>
-            <ns0:tcW ns0:w="1559" ns0:type="dxa"/>
-          </ns0:tcPr>
-          <ns0:p ns1:paraId="4F00FFB5" ns1:textId="5FCF9EC7" ns0:rsidR="001B553F" ns0:rsidRPr="00507815" ns0:rsidRDefault="001B553F" ns0:rsidP="00507815">
-            <ns0:pPr>
-              <ns0:keepNext/>
-              <ns0:spacing ns0:after="0" ns0:line="240" ns0:lineRule="auto"/>
-              <ns0:jc ns0:val="right"/>
-              <ns0:outlineLvl ns0:val="1"/>
-              <ns0:rPr>
-                <ns0:rFonts ns0:cs="Segoe UI"/>
-                <ns0:sz ns0:val="15"/>
-                <ns0:szCs ns0:val="15"/>
-                <ns0:lang ns0:val="en-GB"/>
-              </ns0:rPr>
-            </ns0:pPr>
-            <ns0:r>
-              <ns0:rPr>
-                <ns0:rFonts ns0:cs="Segoe UI"/>
-                <ns0:sz ns0:val="15"/>
-                <ns0:szCs ns0:val="15"/>
-                <ns0:lang ns0:val="en-GB"/>
-              </ns0:rPr>
-              <ns0:t>__LINE_NET__</ns0:t>
-            </ns0:r>
-          </ns0:p>
-        </ns0:tc>
-      </ns0:tr>
-      <ns0:tr xmlns:ns0="http://schemas.openxmlformats.org/wordprocessingml/2006/main" xmlns:ns1="http://schemas.microsoft.com/office/word/2010/wordml" ns0:rsidR="001B553F" ns0:rsidRPr="00507815" ns1:paraId="605E4D66" ns1:textId="77777777" ns0:rsidTr="00507815">
-        <ns0:tblPrEx>
-          <ns0:tblCellMar>
-            <ns0:top ns0:w="0" ns0:type="dxa"/>
-            <ns0:bottom ns0:w="0" ns0:type="dxa"/>
-          </ns0:tblCellMar>
-        </ns0:tblPrEx>
-        <ns0:tc>
-          <ns0:tcPr>
-            <ns0:tcW ns0:w="779" ns0:type="dxa"/>
-          </ns0:tcPr>
-          <ns0:p ns1:paraId="07348269" ns1:textId="77777777" ns0:rsidR="001B553F" ns0:rsidRDefault="001B553F" ns0:rsidP="00507815">
-            <ns0:pPr>
-              <ns0:keepLines/>
-              <ns0:spacing ns0:after="0" ns0:line="240" ns0:lineRule="auto"/>
-              <ns0:outlineLvl ns0:val="2"/>
-              <ns0:rPr>
-                <ns0:rFonts ns0:cs="Segoe UI"/>
-                <ns0:sz ns0:val="15"/>
-                <ns0:szCs ns0:val="15"/>
-              </ns0:rPr>
-            </ns0:pPr>
-          </ns0:p>
-        </ns0:tc>
-        <ns0:tc>
-          <ns0:tcPr>
-            <ns0:tcW ns0:w="5387" ns0:type="dxa"/>
-          </ns0:tcPr>
-          <ns0:p ns1:paraId="047BA162" ns1:textId="47E600F3" ns0:rsidR="001B553F" ns0:rsidRDefault="001B553F" ns0:rsidP="00507815">
-            <ns0:pPr>
-              <ns0:keepNext/>
-              <ns0:spacing ns0:after="0" ns0:line="240" ns0:lineRule="auto"/>
-              <ns0:outlineLvl ns0:val="2"/>
-              <ns0:rPr>
-                <ns0:rFonts ns0:cs="Segoe UI"/>
-                <ns0:sz ns0:val="15"/>
-                <ns0:szCs ns0:val="15"/>
-              </ns0:rPr>
-            </ns0:pPr>
-            <ns0:r>
-              <ns0:rPr>
-                <ns0:rFonts ns0:cs="Segoe UI"/>
-                <ns0:sz ns0:val="15"/>
-                <ns0:szCs ns0:val="15"/>
-              </ns0:rPr>
-              <ns0:t>Summe (netto)</ns0:t>
-            </ns0:r>
-          </ns0:p>
-        </ns0:tc>
-        <ns0:tc>
-          <ns0:tcPr>
-            <ns0:tcW ns0:w="1701" ns0:type="dxa"/>
-          </ns0:tcPr>
-          <ns0:p ns1:paraId="15EAD8AA" ns1:textId="77777777" ns0:rsidR="001B553F" ns0:rsidRDefault="001B553F" ns0:rsidP="00507815">
-            <ns0:pPr>
-              <ns0:spacing ns0:after="0" ns0:line="240" ns0:lineRule="auto"/>
-              <ns0:rPr>
-                <ns0:rFonts ns0:cs="Segoe UI"/>
-                <ns0:sz ns0:val="15"/>
-                <ns0:szCs ns0:val="15"/>
-                <ns0:lang ns0:val="en-GB"/>
-              </ns0:rPr>
-            </ns0:pPr>
-          </ns0:p>
-        </ns0:tc>
-        <ns0:tc>
-          <ns0:tcPr>
-            <ns0:tcW ns0:w="1559" ns0:type="dxa"/>
-          </ns0:tcPr>
-          <ns0:p ns1:paraId="6D869DBD" ns1:textId="5DBF5606" ns0:rsidR="001B553F" ns0:rsidRDefault="001B553F" ns0:rsidP="00507815">
-            <ns0:pPr>
-              <ns0:keepNext/>
-              <ns0:spacing ns0:after="0" ns0:line="240" ns0:lineRule="auto"/>
-              <ns0:jc ns0:val="right"/>
-              <ns0:outlineLvl ns0:val="1"/>
-              <ns0:rPr>
-                <ns0:rFonts ns0:cs="Segoe UI"/>
-                <ns0:sz ns0:val="15"/>
-                <ns0:szCs ns0:val="15"/>
-                <ns0:lang ns0:val="en-GB"/>
-              </ns0:rPr>
-            </ns0:pPr>
-            <ns0:r>
-              <ns0:rPr>
-                <ns0:rFonts ns0:cs="Segoe UI"/>
-                <ns0:sz ns0:val="15"/>
-                <ns0:szCs ns0:val="15"/>
-                <ns0:lang ns0:val="en-GB"/>
-              </ns0:rPr>
-              <ns0:t>__SUM_NET__</ns0:t>
-            </ns0:r>
-          </ns0:p>
-        </ns0:tc>
-      </ns0:tr>
-      <ns0:tr xmlns:ns0="http://schemas.openxmlformats.org/wordprocessingml/2006/main" xmlns:ns1="http://schemas.microsoft.com/office/word/2010/wordml" ns0:rsidR="001B553F" ns0:rsidRPr="00507815" ns1:paraId="23DA52F9" ns1:textId="77777777" ns0:rsidTr="00507815">
-        <ns0:tblPrEx>
-          <ns0:tblCellMar>
-            <ns0:top ns0:w="0" ns0:type="dxa"/>
-            <ns0:bottom ns0:w="0" ns0:type="dxa"/>
-          </ns0:tblCellMar>
-        </ns0:tblPrEx>
-        <ns0:tc>
-          <ns0:tcPr>
-            <ns0:tcW ns0:w="779" ns0:type="dxa"/>
-          </ns0:tcPr>
-          <ns0:p ns1:paraId="1F509A6C" ns1:textId="77777777" ns0:rsidR="001B553F" ns0:rsidRDefault="001B553F" ns0:rsidP="00507815">
-            <ns0:pPr>
-              <ns0:keepLines/>
-              <ns0:spacing ns0:after="0" ns0:line="240" ns0:lineRule="auto"/>
-              <ns0:outlineLvl ns0:val="2"/>
-              <ns0:rPr>
-                <ns0:rFonts ns0:cs="Segoe UI"/>
-                <ns0:sz ns0:val="15"/>
-                <ns0:szCs ns0:val="15"/>
-              </ns0:rPr>
-            </ns0:pPr>
-          </ns0:p>
-        </ns0:tc>
-        <ns0:tc>
-          <ns0:tcPr>
-            <ns0:tcW ns0:w="5387" ns0:type="dxa"/>
-          </ns0:tcPr>
-          <ns0:p ns1:paraId="7240EC62" ns1:textId="5E1D7C35" ns0:rsidR="001B553F" ns0:rsidRPr="001B553F" ns0:rsidRDefault="001B553F" ns0:rsidP="00507815">
-            <ns0:pPr>
-              <ns0:keepNext/>
-              <ns0:spacing ns0:after="0" ns0:line="240" ns0:lineRule="auto"/>
-              <ns0:outlineLvl ns0:val="2"/>
-              <ns0:rPr>
-                <ns0:rFonts ns0:cs="Segoe UI"/>
-                <ns0:i/>
-                <ns0:sz ns0:val="15"/>
-                <ns0:szCs ns0:val="15"/>
-              </ns0:rPr>
-            </ns0:pPr>
-            <ns0:r ns0:rsidRPr="001B553F">
-              <ns0:rPr>
-                <ns0:rFonts ns0:cs="Segoe UI"/>
-                <ns0:i/>
-                <ns0:sz ns0:val="15"/>
-                <ns0:szCs ns0:val="15"/>
-              </ns0:rPr>
-              <ns0:t>__TAX_LABEL__</ns0:t>
-            </ns0:r>
-          </ns0:p>
-        </ns0:tc>
-        <ns0:tc>
-          <ns0:tcPr>
-            <ns0:tcW ns0:w="1701" ns0:type="dxa"/>
-          </ns0:tcPr>
-          <ns0:p ns1:paraId="3FB972EC" ns1:textId="77777777" ns0:rsidR="001B553F" ns0:rsidRDefault="001B553F" ns0:rsidP="00507815">
-            <ns0:pPr>
-              <ns0:spacing ns0:after="0" ns0:line="240" ns0:lineRule="auto"/>
-              <ns0:rPr>
-                <ns0:rFonts ns0:cs="Segoe UI"/>
-                <ns0:sz ns0:val="15"/>
-                <ns0:szCs ns0:val="15"/>
-                <ns0:lang ns0:val="en-GB"/>
-              </ns0:rPr>
-            </ns0:pPr>
-          </ns0:p>
-        </ns0:tc>
-        <ns0:tc>
-          <ns0:tcPr>
-            <ns0:tcW ns0:w="1559" ns0:type="dxa"/>
-          </ns0:tcPr>
-          <ns0:p ns1:paraId="487AA35F" ns1:textId="2C32E2DC" ns0:rsidR="001B553F" ns0:rsidRPr="001B553F" ns0:rsidRDefault="001B553F" ns0:rsidP="00507815">
-            <ns0:pPr>
-              <ns0:keepNext/>
-              <ns0:spacing ns0:after="0" ns0:line="240" ns0:lineRule="auto"/>
-              <ns0:jc ns0:val="right"/>
-              <ns0:outlineLvl ns0:val="1"/>
-              <ns0:rPr>
-                <ns0:rFonts ns0:cs="Segoe UI"/>
-                <ns0:i/>
-                <ns0:sz ns0:val="15"/>
-                <ns0:szCs ns0:val="15"/>
-                <ns0:lang ns0:val="en-GB"/>
-              </ns0:rPr>
-            </ns0:pPr>
-            <ns0:r ns0:rsidRPr="001B553F">
-              <ns0:rPr>
-                <ns0:rFonts ns0:cs="Segoe UI"/>
-                <ns0:i/>
-                <ns0:sz ns0:val="15"/>
-                <ns0:szCs ns0:val="15"/>
-                <ns0:lang ns0:val="en-GB"/>
-              </ns0:rPr>
-              <ns0:t>__TAX_TOTAL__</ns0:t>
-            </ns0:r>
-          </ns0:p>
-        </ns0:tc>
-      </ns0:tr>
-      <ns0:tr xmlns:ns0="http://schemas.openxmlformats.org/wordprocessingml/2006/main" xmlns:ns1="http://schemas.microsoft.com/office/word/2010/wordml" ns0:rsidR="001B553F" ns0:rsidRPr="00507815" ns1:paraId="2DCF0AFA" ns1:textId="77777777" ns0:rsidTr="00507815">
-        <ns0:tblPrEx>
-          <ns0:tblCellMar>
-            <ns0:top ns0:w="0" ns0:type="dxa"/>
-            <ns0:bottom ns0:w="0" ns0:type="dxa"/>
-          </ns0:tblCellMar>
-        </ns0:tblPrEx>
-        <ns0:tc>
-          <ns0:tcPr>
-            <ns0:tcW ns0:w="779" ns0:type="dxa"/>
-          </ns0:tcPr>
-          <ns0:p ns1:paraId="0F6B12D6" ns1:textId="77777777" ns0:rsidR="001B553F" ns0:rsidRDefault="001B553F" ns0:rsidP="00507815">
-            <ns0:pPr>
-              <ns0:keepLines/>
-              <ns0:spacing ns0:after="0" ns0:line="240" ns0:lineRule="auto"/>
-              <ns0:outlineLvl ns0:val="2"/>
-              <ns0:rPr>
-                <ns0:rFonts ns0:cs="Segoe UI"/>
-                <ns0:sz ns0:val="15"/>
-                <ns0:szCs ns0:val="15"/>
-              </ns0:rPr>
-            </ns0:pPr>
-          </ns0:p>
-        </ns0:tc>
-        <ns0:tc>
-          <ns0:tcPr>
-            <ns0:tcW ns0:w="5387" ns0:type="dxa"/>
-          </ns0:tcPr>
-          <ns0:p ns1:paraId="19BE5C42" ns1:textId="44B2EB6C" ns0:rsidR="001B553F" ns0:rsidRPr="001B553F" ns0:rsidRDefault="001B553F" ns0:rsidP="00507815">
-            <ns0:pPr>
-              <ns0:keepNext/>
-              <ns0:spacing ns0:after="0" ns0:line="240" ns0:lineRule="auto"/>
-              <ns0:outlineLvl ns0:val="2"/>
-              <ns0:rPr>
-                <ns0:rFonts ns0:cs="Segoe UI"/>
-                <ns0:b/>
-                <ns0:sz ns0:val="15"/>
-                <ns0:szCs ns0:val="15"/>
-              </ns0:rPr>
-            </ns0:pPr>
-            <ns0:r ns0:rsidRPr="001B553F">
-              <ns0:rPr>
-                <ns0:rFonts ns0:cs="Segoe UI"/>
-                <ns0:b/>
-                <ns0:sz ns0:val="15"/>
-                <ns0:szCs ns0:val="15"/>
-              </ns0:rPr>
-              <ns0:t>Rechnungsbetrag</ns0:t>
-            </ns0:r>
-          </ns0:p>
-        </ns0:tc>
-        <ns0:tc>
-          <ns0:tcPr>
-            <ns0:tcW ns0:w="1701" ns0:type="dxa"/>
-          </ns0:tcPr>
-          <ns0:p ns1:paraId="36E61284" ns1:textId="77777777" ns0:rsidR="001B553F" ns0:rsidRDefault="001B553F" ns0:rsidP="00507815">
-            <ns0:pPr>
-              <ns0:spacing ns0:after="0" ns0:line="240" ns0:lineRule="auto"/>
-              <ns0:rPr>
-                <ns0:rFonts ns0:cs="Segoe UI"/>
-                <ns0:sz ns0:val="15"/>
-                <ns0:szCs ns0:val="15"/>
-                <ns0:lang ns0:val="en-GB"/>
-              </ns0:rPr>
-            </ns0:pPr>
-          </ns0:p>
-        </ns0:tc>
-        <ns0:tc>
-          <ns0:tcPr>
-            <ns0:tcW ns0:w="1559" ns0:type="dxa"/>
-          </ns0:tcPr>
-          <ns0:p ns1:paraId="336110D2" ns1:textId="1EFE6454" ns0:rsidR="001B553F" ns0:rsidRPr="001B553F" ns0:rsidRDefault="001B553F" ns0:rsidP="00507815">
-            <ns0:pPr>
-              <ns0:keepNext/>
-              <ns0:spacing ns0:after="0" ns0:line="240" ns0:lineRule="auto"/>
-              <ns0:jc ns0:val="right"/>
-              <ns0:outlineLvl ns0:val="1"/>
-              <ns0:rPr>
-                <ns0:rFonts ns0:cs="Segoe UI"/>
-                <ns0:b/>
-                <ns0:sz ns0:val="15"/>
-                <ns0:szCs ns0:val="15"/>
-                <ns0:lang ns0:val="en-GB"/>
-              </ns0:rPr>
-            </ns0:pPr>
-            <ns0:r ns0:rsidRPr="001B553F">
-              <ns0:rPr>
-                <ns0:rFonts ns0:cs="Segoe UI"/>
-                <ns0:b/>
-                <ns0:sz ns0:val="15"/>
-                <ns0:szCs ns0:val="15"/>
-                <ns0:lang ns0:val="en-GB"/>
-              </ns0:rPr>
-              <ns0:t>__GROSS__</ns0:t>
-            </ns0:r>
-          </ns0:p>
-        </ns0:tc>
-      </ns0:tr>
+      <w:tr ns2:paraId="745E9F36" ns2:textId="77777777">
+        <w:trPr>
+          <w:cantSplit/>
+        </w:trPr>
+        <w:tblPrEx>
+          <w:tblCellMar>
+            <w:top w:w="0" w:type="dxa"/>
+            <w:bottom w:w="0" w:type="dxa"/>
+          </w:tblCellMar>
+        </w:tblPrEx>
+        <w:tc>
+          <w:tcPr>
+            <w:tcW w:w="779" w:type="dxa"/>
+          </w:tcPr>
+          <w:p ns2:paraId="20611CC3" ns2:textId="77777777">
+            <w:pPr>
+              <w:keepLines/>
+              <w:spacing w:after="0" w:line="240" w:lineRule="auto"/>
+              <w:outlineLvl w:val="2"/>
+              <w:rPr>
+                <w:rFonts w:cs="Segoe UI"/>
+                <w:sz w:val="15"/>
+                <w:szCs w:val="15"/>
+              </w:rPr>
+            </w:pPr>
+            <w:r>
+              <w:rPr>
+                <w:rFonts w:cs="Segoe UI"/>
+                <w:sz w:val="15"/>
+                <w:szCs w:val="15"/>
+              </w:rPr>
+              <w:t>__LINE_POSITION__</w:t>
+            </w:r>
+          </w:p>
+          <w:p ns2:paraId="516BFD19" ns2:textId="77777777">
+            <w:pPr>
+              <w:keepLines/>
+              <w:spacing w:after="0" w:line="240" w:lineRule="auto"/>
+              <w:outlineLvl w:val="2"/>
+              <w:rPr>
+                <w:rFonts w:cs="Segoe UI"/>
+                <w:sz w:val="15"/>
+                <w:szCs w:val="15"/>
+              </w:rPr>
+            </w:pPr>
+            <w:r>
+              <w:rPr>
+                <w:rFonts w:cs="Segoe UI"/>
+                <w:sz w:val="15"/>
+                <w:szCs w:val="15"/>
+              </w:rPr>
+              <w:t/>
+            </w:r>
+            <w:r>
+              <w:t>__LINE_ARTICLE__</w:t>
+            </w:r>
+          </w:p>
+          <w:p ns2:paraId="7C9ECD5F" ns2:textId="36D9854B">
+            <w:pPr>
+              <w:keepLines/>
+              <w:spacing w:after="0" w:line="240" w:lineRule="auto"/>
+              <w:outlineLvl w:val="2"/>
+              <w:rPr>
+                <w:rFonts w:cs="Segoe UI"/>
+                <w:sz w:val="15"/>
+                <w:szCs w:val="15"/>
+              </w:rPr>
+            </w:pPr>
+            <w:r>
+              <w:rPr>
+                <w:rFonts w:cs="Segoe UI"/>
+                <w:sz w:val="15"/>
+                <w:szCs w:val="15"/>
+              </w:rPr>
+              <w:t>__LINE_TAX__</w:t>
+            </w:r>
+          </w:p>
+        </w:tc>
+        <w:tc>
+          <w:tcPr>
+            <w:tcW w:w="5387" w:type="dxa"/>
+          </w:tcPr>
+          <w:p ns2:paraId="68FB6840" ns2:textId="77777777">
+            <w:pPr>
+              <w:keepNext/>
+              <w:spacing w:after="0" w:line="240" w:lineRule="auto"/>
+              <w:outlineLvl w:val="2"/>
+              <w:rPr>
+                <w:rFonts w:cs="Segoe UI"/>
+                <w:sz w:val="15"/>
+                <w:szCs w:val="15"/>
+              </w:rPr>
+            </w:pPr>
+            <w:r>
+              <w:rPr>
+                <w:rFonts w:cs="Segoe UI"/>
+                <w:sz w:val="15"/>
+                <w:szCs w:val="15"/>
+              </w:rPr>
+              <w:t>__LINE_DESCRIPTION__</w:t>
+            </w:r>
+          </w:p>
+        </w:tc>
+        <w:tc>
+          <w:tcPr>
+            <w:tcW w:w="1701" w:type="dxa"/>
+          </w:tcPr>
+          <w:p ns2:paraId="070E69E4" ns2:textId="24EAD3E4">
+            <w:pPr>
+              <w:spacing w:after="0" w:line="240" w:lineRule="auto"/>
+              <w:rPr>
+                <w:rFonts w:cs="Segoe UI"/>
+                <w:sz w:val="15"/>
+                <w:szCs w:val="15"/>
+                <w:lang w:val="en-GB"/>
+              </w:rPr>
+            </w:pPr>
+            <w:r>
+              <w:rPr>
+                <w:rFonts w:cs="Segoe UI"/>
+                <w:sz w:val="15"/>
+                <w:szCs w:val="15"/>
+                <w:lang w:val="en-GB"/>
+              </w:rPr>
+              <w:t>__LINE_QUANTITY__</w:t>
+            </w:r>
+          </w:p>
+        </w:tc>
+        <w:tc>
+          <w:tcPr>
+            <w:tcW w:w="1559" w:type="dxa"/>
+          </w:tcPr>
+          <w:p ns2:paraId="4F00FFB5" ns2:textId="5FCF9EC7">
+            <w:pPr>
+              <w:keepNext/>
+              <w:spacing w:after="0" w:line="240" w:lineRule="auto"/>
+              <w:jc w:val="right"/>
+              <w:outlineLvl w:val="1"/>
+              <w:rPr>
+                <w:rFonts w:cs="Segoe UI"/>
+                <w:sz w:val="15"/>
+                <w:szCs w:val="15"/>
+                <w:lang w:val="en-GB"/>
+              </w:rPr>
+            </w:pPr>
+            <w:r>
+              <w:rPr>
+                <w:rFonts w:cs="Segoe UI"/>
+                <w:sz w:val="15"/>
+                <w:szCs w:val="15"/>
+                <w:lang w:val="en-GB"/>
+              </w:rPr>
+              <w:t>__LINE_NET__</w:t>
+            </w:r>
+          </w:p>
+        </w:tc>
+      </w:tr>
+      <w:tr ns2:paraId="605E4D66" ns2:textId="77777777">
+        <w:trPr>
+          <w:cantSplit/>
+        </w:trPr>
+        <w:tblPrEx>
+          <w:tblCellMar>
+            <w:top w:w="0" w:type="dxa"/>
+            <w:bottom w:w="0" w:type="dxa"/>
+          </w:tblCellMar>
+        </w:tblPrEx>
+        <w:tc>
+          <w:tcPr>
+            <w:tcW w:w="779" w:type="dxa"/>
+          </w:tcPr>
+          <w:p ns2:paraId="07348269" ns2:textId="77777777">
+            <w:pPr>
+              <w:keepLines/>
+              <w:spacing w:after="0" w:line="240" w:lineRule="auto"/>
+              <w:outlineLvl w:val="2"/>
+              <w:rPr>
+                <w:rFonts w:cs="Segoe UI"/>
+                <w:sz w:val="15"/>
+                <w:szCs w:val="15"/>
+              </w:rPr>
+            </w:pPr>
+          </w:p>
+        </w:tc>
+        <w:tc>
+          <w:tcPr>
+            <w:tcW w:w="5387" w:type="dxa"/>
+          </w:tcPr>
+          <w:p ns2:paraId="047BA162" ns2:textId="47E600F3">
+            <w:pPr>
+              <w:keepNext/>
+              <w:spacing w:after="0" w:line="240" w:lineRule="auto"/>
+              <w:outlineLvl w:val="2"/>
+              <w:rPr>
+                <w:rFonts w:cs="Segoe UI"/>
+                <w:sz w:val="15"/>
+                <w:szCs w:val="15"/>
+              </w:rPr>
+            </w:pPr>
+            <w:r>
+              <w:rPr>
+                <w:rFonts w:cs="Segoe UI"/>
+                <w:sz w:val="15"/>
+                <w:szCs w:val="15"/>
+              </w:rPr>
+              <w:t>Summe (netto)</w:t>
+            </w:r>
+          </w:p>
+        </w:tc>
+        <w:tc>
+          <w:tcPr>
+            <w:tcW w:w="1701" w:type="dxa"/>
+          </w:tcPr>
+          <w:p ns2:paraId="15EAD8AA" ns2:textId="77777777">
+            <w:pPr>
+              <w:spacing w:after="0" w:line="240" w:lineRule="auto"/>
+              <w:rPr>
+                <w:rFonts w:cs="Segoe UI"/>
+                <w:sz w:val="15"/>
+                <w:szCs w:val="15"/>
+                <w:lang w:val="en-GB"/>
+              </w:rPr>
+            </w:pPr>
+          </w:p>
+        </w:tc>
+        <w:tc>
+          <w:tcPr>
+            <w:tcW w:w="1559" w:type="dxa"/>
+          </w:tcPr>
+          <w:p ns2:paraId="6D869DBD" ns2:textId="5DBF5606">
+            <w:pPr>
+              <w:keepNext/>
+              <w:spacing w:after="0" w:line="240" w:lineRule="auto"/>
+              <w:jc w:val="right"/>
+              <w:outlineLvl w:val="1"/>
+              <w:rPr>
+                <w:rFonts w:cs="Segoe UI"/>
+                <w:sz w:val="15"/>
+                <w:szCs w:val="15"/>
+                <w:lang w:val="en-GB"/>
+              </w:rPr>
+            </w:pPr>
+            <w:r>
+              <w:rPr>
+                <w:rFonts w:cs="Segoe UI"/>
+                <w:sz w:val="15"/>
+                <w:szCs w:val="15"/>
+                <w:lang w:val="en-GB"/>
+              </w:rPr>
+              <w:t>__SUM_NET__</w:t>
+            </w:r>
+          </w:p>
+        </w:tc>
+      </w:tr>
+      <w:tr ns2:paraId="23DA52F9" ns2:textId="77777777">
+        <w:trPr>
+          <w:cantSplit/>
+        </w:trPr>
+        <w:tblPrEx>
+          <w:tblCellMar>
+            <w:top w:w="0" w:type="dxa"/>
+            <w:bottom w:w="0" w:type="dxa"/>
+          </w:tblCellMar>
+        </w:tblPrEx>
+        <w:tc>
+          <w:tcPr>
+            <w:tcW w:w="779" w:type="dxa"/>
+          </w:tcPr>
+          <w:p ns2:paraId="1F509A6C" ns2:textId="77777777">
+            <w:pPr>
+              <w:keepLines/>
+              <w:spacing w:after="0" w:line="240" w:lineRule="auto"/>
+              <w:outlineLvl w:val="2"/>
+              <w:rPr>
+                <w:rFonts w:cs="Segoe UI"/>
+                <w:sz w:val="15"/>
+                <w:szCs w:val="15"/>
+              </w:rPr>
+            </w:pPr>
+          </w:p>
+        </w:tc>
+        <w:tc>
+          <w:tcPr>
+            <w:tcW w:w="5387" w:type="dxa"/>
+          </w:tcPr>
+          <w:p ns2:paraId="7240EC62" ns2:textId="5E1D7C35">
+            <w:pPr>
+              <w:keepNext/>
+              <w:spacing w:after="0" w:line="240" w:lineRule="auto"/>
+              <w:outlineLvl w:val="2"/>
+              <w:rPr>
+                <w:rFonts w:cs="Segoe UI"/>
+                <w:i/>
+                <w:sz w:val="15"/>
+                <w:szCs w:val="15"/>
+              </w:rPr>
+            </w:pPr>
+            <w:r>
+              <w:rPr>
+                <w:rFonts w:cs="Segoe UI"/>
+                <w:i/>
+                <w:sz w:val="15"/>
+                <w:szCs w:val="15"/>
+              </w:rPr>
+              <w:t>__TAX_LABEL__</w:t>
+            </w:r>
+          </w:p>
+        </w:tc>
+        <w:tc>
+          <w:tcPr>
+            <w:tcW w:w="1701" w:type="dxa"/>
+          </w:tcPr>
+          <w:p ns2:paraId="3FB972EC" ns2:textId="77777777">
+            <w:pPr>
+              <w:spacing w:after="0" w:line="240" w:lineRule="auto"/>
+              <w:rPr>
+                <w:rFonts w:cs="Segoe UI"/>
+                <w:sz w:val="15"/>
+                <w:szCs w:val="15"/>
+                <w:lang w:val="en-GB"/>
+              </w:rPr>
+            </w:pPr>
+          </w:p>
+        </w:tc>
+        <w:tc>
+          <w:tcPr>
+            <w:tcW w:w="1559" w:type="dxa"/>
+          </w:tcPr>
+          <w:p ns2:paraId="487AA35F" ns2:textId="2C32E2DC">
+            <w:pPr>
+              <w:keepNext/>
+              <w:spacing w:after="0" w:line="240" w:lineRule="auto"/>
+              <w:jc w:val="right"/>
+              <w:outlineLvl w:val="1"/>
+              <w:rPr>
+                <w:rFonts w:cs="Segoe UI"/>
+                <w:i/>
+                <w:sz w:val="15"/>
+                <w:szCs w:val="15"/>
+                <w:lang w:val="en-GB"/>
+              </w:rPr>
+            </w:pPr>
+            <w:r>
+              <w:rPr>
+                <w:rFonts w:cs="Segoe UI"/>
+                <w:i/>
+                <w:sz w:val="15"/>
+                <w:szCs w:val="15"/>
+                <w:lang w:val="en-GB"/>
+              </w:rPr>
+              <w:t>__TAX_TOTAL__</w:t>
+            </w:r>
+          </w:p>
+        </w:tc>
+      </w:tr>
+      <w:tr ns2:paraId="2DCF0AFA" ns2:textId="77777777">
+        <w:trPr>
+          <w:cantSplit/>
+        </w:trPr>
+        <w:tblPrEx>
+          <w:tblCellMar>
+            <w:top w:w="0" w:type="dxa"/>
+            <w:bottom w:w="0" w:type="dxa"/>
+          </w:tblCellMar>
+        </w:tblPrEx>
+        <w:tc>
+          <w:tcPr>
+            <w:tcW w:w="779" w:type="dxa"/>
+          </w:tcPr>
+          <w:p ns2:paraId="0F6B12D6" ns2:textId="77777777">
+            <w:pPr>
+              <w:keepLines/>
+              <w:spacing w:after="0" w:line="240" w:lineRule="auto"/>
+              <w:outlineLvl w:val="2"/>
+              <w:rPr>
+                <w:rFonts w:cs="Segoe UI"/>
+                <w:sz w:val="15"/>
+                <w:szCs w:val="15"/>
+              </w:rPr>
+            </w:pPr>
+          </w:p>
+        </w:tc>
+        <w:tc>
+          <w:tcPr>
+            <w:tcW w:w="5387" w:type="dxa"/>
+          </w:tcPr>
+          <w:p ns2:paraId="19BE5C42" ns2:textId="44B2EB6C">
+            <w:pPr>
+              <w:keepNext/>
+              <w:spacing w:after="0" w:line="240" w:lineRule="auto"/>
+              <w:outlineLvl w:val="2"/>
+              <w:rPr>
+                <w:rFonts w:cs="Segoe UI"/>
+                <w:b/>
+                <w:sz w:val="15"/>
+                <w:szCs w:val="15"/>
+              </w:rPr>
+            </w:pPr>
+            <w:r>
+              <w:rPr>
+                <w:rFonts w:cs="Segoe UI"/>
+                <w:b/>
+                <w:sz w:val="15"/>
+                <w:szCs w:val="15"/>
+              </w:rPr>
+              <w:t>Rechnungsbetrag</w:t>
+            </w:r>
+          </w:p>
+        </w:tc>
+        <w:tc>
+          <w:tcPr>
+            <w:tcW w:w="1701" w:type="dxa"/>
+          </w:tcPr>
+          <w:p ns2:paraId="36E61284" ns2:textId="77777777">
+            <w:pPr>
+              <w:spacing w:after="0" w:line="240" w:lineRule="auto"/>
+              <w:rPr>
+                <w:rFonts w:cs="Segoe UI"/>
+                <w:sz w:val="15"/>
+                <w:szCs w:val="15"/>
+                <w:lang w:val="en-GB"/>
+              </w:rPr>
+            </w:pPr>
+          </w:p>
+        </w:tc>
+        <w:tc>
+          <w:tcPr>
+            <w:tcW w:w="1559" w:type="dxa"/>
+          </w:tcPr>
+          <w:p ns2:paraId="336110D2" ns2:textId="1EFE6454">
+            <w:pPr>
+              <w:keepNext/>
+              <w:spacing w:after="0" w:line="240" w:lineRule="auto"/>
+              <w:jc w:val="right"/>
+              <w:outlineLvl w:val="1"/>
+              <w:rPr>
+                <w:rFonts w:cs="Segoe UI"/>
+                <w:b/>
+                <w:sz w:val="15"/>
+                <w:szCs w:val="15"/>
+                <w:lang w:val="en-GB"/>
+              </w:rPr>
+            </w:pPr>
+            <w:r>
+              <w:rPr>
+                <w:rFonts w:cs="Segoe UI"/>
+                <w:b/>
+                <w:sz w:val="15"/>
+                <w:szCs w:val="15"/>
+                <w:lang w:val="en-GB"/>
+              </w:rPr>
+              <w:t>__GROSS__</w:t>
+            </w:r>
+          </w:p>
+        </w:tc>
+      </w:tr>
     </w:tbl>
-    <w:p>
+    <w:p ns2:paraId="05F5E4D9" ns2:textId="77777777">
       <w:pPr>
         <w:spacing w:after="0" w:line="240" w:lineRule="auto"/>
         <w:rPr>
@@ -1887,7 +1906,7 @@
       <w:bookmarkStart w:id="10" w:name="Tabelle"/>
       <w:bookmarkEnd w:id="10"/>
     </w:p>
-    <w:p>
+    <w:p ns2:paraId="4559130D" ns2:textId="77777777">
       <w:pPr>
         <w:spacing w:after="0" w:line="240" w:lineRule="auto"/>
         <w:rPr>
@@ -1914,7 +1933,7 @@
         <w:t>:</w:t>
       </w:r>
     </w:p>
-    <w:p>
+    <w:p ns2:paraId="053CB8BC" ns2:textId="77777777">
       <w:pPr>
         <w:spacing w:after="0" w:line="240" w:lineRule="auto"/>
         <w:rPr>
@@ -2394,7 +2413,7 @@
         <w:t>__INVOICE_NOTE__</w:t>
       </w:r>
     </w:p>
-    <w:p>
+    <w:p ns2:paraId="0587C411" ns2:textId="77777777">
       <w:pPr>
         <w:spacing w:after="0" w:line="240" w:lineRule="auto"/>
         <w:rPr>
@@ -2413,7 +2432,7 @@
         <w:t>Einwendungen gegen Entgeltabrechnungen von tops.net sind sofort nach Rechnungserhalt, aber spätestens zwei Wochen nach Abrechnungs- oder Rechnungsdatum, ohne dass hierdurch jedoch die Fälligkeit berührt wird, zu erheben. Die Unterlassung rechtzeitiger Einwendungen gilt als Genehmigung.</w:t>
       </w:r>
     </w:p>
-    <w:p>
+    <w:p ns2:paraId="44796364" ns2:textId="77777777">
       <w:pPr>
         <w:spacing w:before="120" w:after="0" w:line="240" w:lineRule="auto"/>
         <w:rPr>
@@ -2440,14 +2459,14 @@
         <w:t>: Sofern kein Lieferdatum oder Leistungszeitraum explizit angegeben wurde, entspricht das Lieferdatum dem Rechnungsdatum bzw. der Leistungszeitraum dem Rechnungsmonat.</w:t>
       </w:r>
     </w:p>
-    <w:p/>
+    <w:p ns2:paraId="7FE6DB66" ns2:textId="77777777"/>
     <w:sectPr>
-      <w:headerReference w:type="even" r:id="rId8"/>
-      <w:headerReference w:type="default" r:id="rId9"/>
-      <w:footerReference w:type="even" r:id="rId10"/>
-      <w:footerReference w:type="default" r:id="rId11"/>
-      <w:headerReference w:type="first" r:id="rId12"/>
-      <w:footerReference w:type="first" r:id="rId13"/>
+      <w:headerReference w:type="even" ns10:id="rId8"/>
+      <w:headerReference w:type="default" ns10:id="rId9"/>
+      <w:footerReference w:type="even" ns10:id="rId10"/>
+      <w:footerReference w:type="default" ns10:id="rId11"/>
+      <w:headerReference w:type="first" ns10:id="rId12"/>
+      <w:footerReference w:type="first" ns10:id="rId13"/>
       <w:pgSz w:w="11907" w:h="16840" w:code="9"/>
       <w:pgMar w:top="1985" w:right="1418" w:bottom="1418" w:left="1418" w:header="720" w:footer="720" w:gutter="0"/>
       <w:cols w:space="720"/>

</xml_diff>